<commit_message>
Se hacen bastantes cambios (Principalmente estructurales) debido a que se comenzó a usar el software Antigraviy de google. Se crea la carpeta Pruebas_Gravity en donde se hace un esquema del sistema completo (De momento en pruebas) y se crea la carpeta Servidores_MCP, donde se guardan las diferentes versiones creadas del servidor MCP principal. Se hace debugging de varios códigos y se implementa el uso de LLMs mucho más grandes utilizando OpenRouter (Se manejaron las ApiKeys tal que no se subieran al repositorio). Para finalizar, se deja el comentario de que fue posible (O almenos no se logró) incorporar los modelos gratuitos que expone Google AI, debido a alto nivel de dependencias del cliente que expone google, el cual no era del todo compatible con Dspy (Me rendí en intentar hacer de puente entre el cliente y dspy) debido a que no maneja el mismo formato OpenAI like.
</commit_message>
<xml_diff>
--- a/Avances_Proyecto/Reporte_gpt_máquina usada para el proyecto.docx
+++ b/Avances_Proyecto/Reporte_gpt_máquina usada para el proyecto.docx
@@ -4,6 +4,20 @@
   <w:body>
     <w:p>
       <w:r>
+        <w:t xml:space="preserve">Reporte hecho por </w:t>
+      </w:r>
+      <w:proofErr w:type="spellStart"/>
+      <w:r>
+        <w:t>ChatGPT</w:t>
+      </w:r>
+      <w:proofErr w:type="spellEnd"/>
+      <w:r>
+        <w:t xml:space="preserve"> sobre la información relevante de la máquina utilizada para correr los programas y pruebas:</w:t>
+      </w:r>
+    </w:p>
+    <w:p/>
+    <w:p>
+      <w:r>
         <w:t xml:space="preserve">Perfecto — este es un </w:t>
       </w:r>
       <w:r>
@@ -34,7 +48,7 @@
     <w:p>
       <w:r>
         <w:pict w14:anchorId="145597F5">
-          <v:rect id="_x0000_i1097" style="width:0;height:1.5pt" o:hralign="center" o:hrstd="t" o:hr="t" fillcolor="#a0a0a0" stroked="f"/>
+          <v:rect id="_x0000_i1025" style="width:0;height:1.5pt" o:hralign="center" o:hrstd="t" o:hr="t" fillcolor="#a0a0a0" stroked="f"/>
         </w:pict>
       </w:r>
     </w:p>
@@ -204,7 +218,7 @@
     <w:p>
       <w:r>
         <w:pict w14:anchorId="32B34A6D">
-          <v:rect id="_x0000_i1098" style="width:0;height:1.5pt" o:hralign="center" o:hrstd="t" o:hr="t" fillcolor="#a0a0a0" stroked="f"/>
+          <v:rect id="_x0000_i1026" style="width:0;height:1.5pt" o:hralign="center" o:hrstd="t" o:hr="t" fillcolor="#a0a0a0" stroked="f"/>
         </w:pict>
       </w:r>
     </w:p>
@@ -443,6 +457,7 @@
         </w:numPr>
       </w:pPr>
       <w:r>
+        <w:lastRenderedPageBreak/>
         <w:t xml:space="preserve">AVX-512 </w:t>
       </w:r>
       <w:r>
@@ -480,7 +495,6 @@
         </w:numPr>
       </w:pPr>
       <w:r>
-        <w:lastRenderedPageBreak/>
         <w:t xml:space="preserve">FMA, F16C, BMI1/2 </w:t>
       </w:r>
       <w:r>
@@ -552,7 +566,7 @@
     <w:p>
       <w:r>
         <w:pict w14:anchorId="233B08D2">
-          <v:rect id="_x0000_i1099" style="width:0;height:1.5pt" o:hralign="center" o:hrstd="t" o:hr="t" fillcolor="#a0a0a0" stroked="f"/>
+          <v:rect id="_x0000_i1027" style="width:0;height:1.5pt" o:hralign="center" o:hrstd="t" o:hr="t" fillcolor="#a0a0a0" stroked="f"/>
         </w:pict>
       </w:r>
     </w:p>
@@ -631,7 +645,7 @@
     <w:p>
       <w:r>
         <w:pict w14:anchorId="2ACE363C">
-          <v:rect id="_x0000_i1100" style="width:0;height:1.5pt" o:hralign="center" o:hrstd="t" o:hr="t" fillcolor="#a0a0a0" stroked="f"/>
+          <v:rect id="_x0000_i1028" style="width:0;height:1.5pt" o:hralign="center" o:hrstd="t" o:hr="t" fillcolor="#a0a0a0" stroked="f"/>
         </w:pict>
       </w:r>
     </w:p>
@@ -763,7 +777,7 @@
     <w:p>
       <w:r>
         <w:pict w14:anchorId="44035C63">
-          <v:rect id="_x0000_i1101" style="width:0;height:1.5pt" o:hralign="center" o:hrstd="t" o:hr="t" fillcolor="#a0a0a0" stroked="f"/>
+          <v:rect id="_x0000_i1029" style="width:0;height:1.5pt" o:hralign="center" o:hrstd="t" o:hr="t" fillcolor="#a0a0a0" stroked="f"/>
         </w:pict>
       </w:r>
     </w:p>
@@ -873,7 +887,7 @@
     <w:p>
       <w:r>
         <w:pict w14:anchorId="4FFC0B78">
-          <v:rect id="_x0000_i1102" style="width:0;height:1.5pt" o:hralign="center" o:hrstd="t" o:hr="t" fillcolor="#a0a0a0" stroked="f"/>
+          <v:rect id="_x0000_i1030" style="width:0;height:1.5pt" o:hralign="center" o:hrstd="t" o:hr="t" fillcolor="#a0a0a0" stroked="f"/>
         </w:pict>
       </w:r>
     </w:p>
@@ -890,6 +904,7 @@
           <w:b/>
           <w:bCs/>
         </w:rPr>
+        <w:lastRenderedPageBreak/>
         <w:t>🔊</w:t>
       </w:r>
       <w:r>
@@ -912,7 +927,6 @@
           <w:b/>
           <w:bCs/>
         </w:rPr>
-        <w:lastRenderedPageBreak/>
         <w:t>Dispositivo principal:</w:t>
       </w:r>
       <w:r>
@@ -958,7 +972,7 @@
     <w:p>
       <w:r>
         <w:pict w14:anchorId="1350DBB4">
-          <v:rect id="_x0000_i1103" style="width:0;height:1.5pt" o:hralign="center" o:hrstd="t" o:hr="t" fillcolor="#a0a0a0" stroked="f"/>
+          <v:rect id="_x0000_i1031" style="width:0;height:1.5pt" o:hralign="center" o:hrstd="t" o:hr="t" fillcolor="#a0a0a0" stroked="f"/>
         </w:pict>
       </w:r>
     </w:p>
@@ -1054,7 +1068,7 @@
     <w:p>
       <w:r>
         <w:pict w14:anchorId="20094B74">
-          <v:rect id="_x0000_i1104" style="width:0;height:1.5pt" o:hralign="center" o:hrstd="t" o:hr="t" fillcolor="#a0a0a0" stroked="f"/>
+          <v:rect id="_x0000_i1032" style="width:0;height:1.5pt" o:hralign="center" o:hrstd="t" o:hr="t" fillcolor="#a0a0a0" stroked="f"/>
         </w:pict>
       </w:r>
     </w:p>
@@ -1212,7 +1226,7 @@
     <w:p>
       <w:r>
         <w:pict w14:anchorId="1FA06A6C">
-          <v:rect id="_x0000_i1105" style="width:0;height:1.5pt" o:hralign="center" o:hrstd="t" o:hr="t" fillcolor="#a0a0a0" stroked="f"/>
+          <v:rect id="_x0000_i1033" style="width:0;height:1.5pt" o:hralign="center" o:hrstd="t" o:hr="t" fillcolor="#a0a0a0" stroked="f"/>
         </w:pict>
       </w:r>
     </w:p>
@@ -1282,7 +1296,7 @@
     <w:p>
       <w:r>
         <w:pict w14:anchorId="681F7D6F">
-          <v:rect id="_x0000_i1106" style="width:0;height:1.5pt" o:hralign="center" o:hrstd="t" o:hr="t" fillcolor="#a0a0a0" stroked="f"/>
+          <v:rect id="_x0000_i1034" style="width:0;height:1.5pt" o:hralign="center" o:hrstd="t" o:hr="t" fillcolor="#a0a0a0" stroked="f"/>
         </w:pict>
       </w:r>
     </w:p>
@@ -1433,6 +1447,7 @@
               <w:rPr>
                 <w:rFonts w:ascii="Segoe UI Emoji" w:hAnsi="Segoe UI Emoji" w:cs="Segoe UI Emoji"/>
               </w:rPr>
+              <w:lastRenderedPageBreak/>
               <w:t>⚙️</w:t>
             </w:r>
             <w:r>
@@ -1468,7 +1483,6 @@
               <w:rPr>
                 <w:rFonts w:ascii="Segoe UI Emoji" w:hAnsi="Segoe UI Emoji" w:cs="Segoe UI Emoji"/>
               </w:rPr>
-              <w:lastRenderedPageBreak/>
               <w:t>🎮</w:t>
             </w:r>
             <w:r>
@@ -1681,7 +1695,7 @@
     <w:p>
       <w:r>
         <w:pict w14:anchorId="1B1C011D">
-          <v:rect id="_x0000_i1107" style="width:0;height:1.5pt" o:hralign="center" o:hrstd="t" o:hr="t" fillcolor="#a0a0a0" stroked="f"/>
+          <v:rect id="_x0000_i1035" style="width:0;height:1.5pt" o:hralign="center" o:hrstd="t" o:hr="t" fillcolor="#a0a0a0" stroked="f"/>
         </w:pict>
       </w:r>
     </w:p>
@@ -3927,6 +3941,7 @@
   <w:style w:type="character" w:default="1" w:styleId="Fuentedeprrafopredeter">
     <w:name w:val="Default Paragraph Font"/>
     <w:uiPriority w:val="1"/>
+    <w:semiHidden/>
     <w:unhideWhenUsed/>
   </w:style>
   <w:style w:type="table" w:default="1" w:styleId="Tablanormal">

</xml_diff>